<commit_message>
docs(carving): matrix figure + update overview and publishability memo
Add Figure 9 (fig9_matrix, log-scale grouped bars: S0 stamping / S1 swept / S2 +pruning per workload) to the paper (docx/pdf) and carving-simulation.md §7.1. Update description.md §9 with the post-swept optimizations + the cross-workload matrix pointer, and paper.md (publishability memo): the literature-anchored matrix + workload suite now resolve the previously-flagged weaknesses #2 (baseline vs known methods) and #3 (single benchmark).

Co-Authored-By: Claude Opus 4.8 <noreply@anthropic.com>
</commit_message>
<xml_diff>
--- a/DOCS/carving-swept-subtraction.docx
+++ b/DOCS/carving-swept-subtraction.docx
@@ -5306,7 +5306,7 @@
     </w:p>
     <w:bookmarkEnd w:id="61"/>
     <w:bookmarkEnd w:id="62"/>
-    <w:bookmarkStart w:id="68" w:name="results"/>
+    <w:bookmarkStart w:id="71" w:name="results"/>
     <w:p>
       <w:pPr>
         <w:pStyle w:val="Heading2"/>
@@ -5851,7 +5851,7 @@
         <w:t xml:space="preserve">bit-exact. Tube pruning of §3.6 is applied on top of that swept baseline.</w:t>
       </w:r>
     </w:p>
-    <w:bookmarkStart w:id="66" w:name="X4fd69d9057cb8b0e068bcf29946e6167fc3f833"/>
+    <w:bookmarkStart w:id="69" w:name="X4fd69d9057cb8b0e068bcf29946e6167fc3f833"/>
     <w:p>
       <w:pPr>
         <w:pStyle w:val="Heading3"/>
@@ -6762,8 +6762,97 @@
         <w:t xml:space="preserve">.</w:t>
       </w:r>
     </w:p>
-    <w:bookmarkEnd w:id="66"/>
-    <w:bookmarkStart w:id="67" w:name="working-set-a-sparse-tiled-study"/>
+    <w:p>
+      <w:pPr>
+        <w:pStyle w:val="CaptionedFigure"/>
+      </w:pPr>
+      <w:r>
+        <w:drawing>
+          <wp:inline>
+            <wp:extent cx="5334000" cy="2861082"/>
+            <wp:effectExtent b="0" l="0" r="0" t="0"/>
+            <wp:docPr descr="Figure 9. Net carving time per machining workload and refinement level (log scale). S0→S1 (grey→blue) is the established swept method’s uniform ~12× gain over per-step stamping; S1→S2 (blue→green) is this work’s tube-pruning + in-air skip — it pays where the dispatch over-covers (45° raster 2.82×, air-heavy 2.15×), is neutral on axis-aligned work, and costs a little on the dense finishing raster." title="" id="67" name="Picture"/>
+            <a:graphic>
+              <a:graphicData uri="http://schemas.openxmlformats.org/drawingml/2006/picture">
+                <pic:pic>
+                  <pic:nvPicPr>
+                    <pic:cNvPr descr="/home/nicola/Documents/development/autocam/DOCS/figures/fig9_matrix.emf" id="68" name="Picture"/>
+                    <pic:cNvPicPr>
+                      <a:picLocks noChangeArrowheads="1" noChangeAspect="1"/>
+                    </pic:cNvPicPr>
+                  </pic:nvPicPr>
+                  <pic:blipFill>
+                    <a:blip r:embed="rId66"/>
+                    <a:stretch>
+                      <a:fillRect/>
+                    </a:stretch>
+                  </pic:blipFill>
+                  <pic:spPr bwMode="auto">
+                    <a:xfrm>
+                      <a:off x="0" y="0"/>
+                      <a:ext cx="5334000" cy="2861082"/>
+                    </a:xfrm>
+                    <a:prstGeom prst="rect">
+                      <a:avLst/>
+                    </a:prstGeom>
+                    <a:noFill/>
+                    <a:ln w="9525">
+                      <a:noFill/>
+                      <a:headEnd/>
+                      <a:tailEnd/>
+                    </a:ln>
+                  </pic:spPr>
+                </pic:pic>
+              </a:graphicData>
+            </a:graphic>
+          </wp:inline>
+        </w:drawing>
+      </w:r>
+    </w:p>
+    <w:p>
+      <w:pPr>
+        <w:pStyle w:val="ImageCaption"/>
+      </w:pPr>
+      <w:r>
+        <w:rPr>
+          <w:bCs/>
+          <w:b/>
+        </w:rPr>
+        <w:t xml:space="preserve">Figure 9.</w:t>
+      </w:r>
+      <w:r>
+        <w:t xml:space="preserve"> </w:t>
+      </w:r>
+      <w:r>
+        <w:t xml:space="preserve">Net carving time per machining workload and refinement level (log scale). S0→S1</w:t>
+      </w:r>
+      <w:r>
+        <w:t xml:space="preserve"> </w:t>
+      </w:r>
+      <w:r>
+        <w:t xml:space="preserve">(grey→blue) is the established swept method’s uniform ~12× gain over per-step stamping; S1→S2</w:t>
+      </w:r>
+      <w:r>
+        <w:t xml:space="preserve"> </w:t>
+      </w:r>
+      <w:r>
+        <w:t xml:space="preserve">(blue→green) is this work’s tube-pruning + in-air skip — it pays where the dispatch over-covers (45°</w:t>
+      </w:r>
+      <w:r>
+        <w:t xml:space="preserve"> </w:t>
+      </w:r>
+      <w:r>
+        <w:t xml:space="preserve">raster 2.82×, air-heavy 2.15×), is neutral on axis-aligned work, and costs a little on the dense</w:t>
+      </w:r>
+      <w:r>
+        <w:t xml:space="preserve"> </w:t>
+      </w:r>
+      <w:r>
+        <w:t xml:space="preserve">finishing raster.</w:t>
+      </w:r>
+    </w:p>
+    <w:bookmarkEnd w:id="69"/>
+    <w:bookmarkStart w:id="70" w:name="working-set-a-sparse-tiled-study"/>
     <w:p>
       <w:pPr>
         <w:pStyle w:val="Heading3"/>
@@ -6993,9 +7082,9 @@
         </w:pict>
       </w:r>
     </w:p>
-    <w:bookmarkEnd w:id="67"/>
-    <w:bookmarkEnd w:id="68"/>
-    <w:bookmarkStart w:id="69" w:name="discussion"/>
+    <w:bookmarkEnd w:id="70"/>
+    <w:bookmarkEnd w:id="71"/>
+    <w:bookmarkStart w:id="72" w:name="discussion"/>
     <w:p>
       <w:pPr>
         <w:pStyle w:val="Heading2"/>
@@ -7613,8 +7702,8 @@
         </w:pict>
       </w:r>
     </w:p>
-    <w:bookmarkEnd w:id="69"/>
-    <w:bookmarkStart w:id="70" w:name="conclusions"/>
+    <w:bookmarkEnd w:id="72"/>
+    <w:bookmarkStart w:id="73" w:name="conclusions"/>
     <w:p>
       <w:pPr>
         <w:pStyle w:val="Heading2"/>
@@ -7721,8 +7810,8 @@
         </w:pict>
       </w:r>
     </w:p>
-    <w:bookmarkEnd w:id="70"/>
-    <w:bookmarkStart w:id="71" w:name="appendix-a.-terminology"/>
+    <w:bookmarkEnd w:id="73"/>
+    <w:bookmarkStart w:id="74" w:name="appendix-a.-terminology"/>
     <w:p>
       <w:pPr>
         <w:pStyle w:val="Heading2"/>
@@ -8741,8 +8830,8 @@
         </w:pict>
       </w:r>
     </w:p>
-    <w:bookmarkEnd w:id="71"/>
-    <w:bookmarkStart w:id="72" w:name="references"/>
+    <w:bookmarkEnd w:id="74"/>
+    <w:bookmarkStart w:id="75" w:name="references"/>
     <w:p>
       <w:pPr>
         <w:pStyle w:val="Heading2"/>
@@ -9111,7 +9200,7 @@
         <w:t xml:space="preserve">Computer Graphics Forum, 27(8):2028–2039, 2008.</w:t>
       </w:r>
     </w:p>
-    <w:bookmarkEnd w:id="72"/>
+    <w:bookmarkEnd w:id="75"/>
     <w:sectPr/>
   </w:body>
 </w:document>

</xml_diff>